<commit_message>
docs: embed high-resolution architectural diagrams and dashboard figures into final project report
</commit_message>
<xml_diff>
--- a/Final_Project_Report_Distributed_Systems.docx
+++ b/Final_Project_Report_Distributed_Systems.docx
@@ -3002,6 +3002,72 @@
     </w:p>
     <w:p>
       <w:pPr>
+        <w:spacing w:before="200" w:after="80"/>
+        <w:jc w:val="center"/>
+      </w:pPr>
+      <w:r>
+        <w:drawing>
+          <wp:inline xmlns:a="http://schemas.openxmlformats.org/drawingml/2006/main" xmlns:pic="http://schemas.openxmlformats.org/drawingml/2006/picture">
+            <wp:extent cx="5669280" cy="3763640"/>
+            <wp:docPr id="1" name="Picture 1"/>
+            <wp:cNvGraphicFramePr>
+              <a:graphicFrameLocks noChangeAspect="1"/>
+            </wp:cNvGraphicFramePr>
+            <a:graphic>
+              <a:graphicData uri="http://schemas.openxmlformats.org/drawingml/2006/picture">
+                <pic:pic>
+                  <pic:nvPicPr>
+                    <pic:cNvPr id="0" name="fig1_system_architecture.png"/>
+                    <pic:cNvPicPr/>
+                  </pic:nvPicPr>
+                  <pic:blipFill>
+                    <a:blip r:embed="rId9"/>
+                    <a:stretch>
+                      <a:fillRect/>
+                    </a:stretch>
+                  </pic:blipFill>
+                  <pic:spPr>
+                    <a:xfrm>
+                      <a:off x="0" y="0"/>
+                      <a:ext cx="5669280" cy="3763640"/>
+                    </a:xfrm>
+                    <a:prstGeom prst="rect"/>
+                  </pic:spPr>
+                </pic:pic>
+              </a:graphicData>
+            </a:graphic>
+          </wp:inline>
+        </w:drawing>
+      </w:r>
+    </w:p>
+    <w:p>
+      <w:pPr>
+        <w:spacing w:before="40" w:after="240" w:line="276" w:lineRule="auto"/>
+        <w:jc w:val="center"/>
+      </w:pPr>
+      <w:r>
+        <w:rPr>
+          <w:rFonts w:ascii="Calibri" w:hAnsi="Calibri"/>
+          <w:b/>
+          <w:i w:val="0"/>
+          <w:color w:val="1B365D"/>
+          <w:sz w:val="19"/>
+        </w:rPr>
+        <w:t xml:space="preserve">Figure 4.1: </w:t>
+      </w:r>
+      <w:r>
+        <w:rPr>
+          <w:rFonts w:ascii="Calibri" w:hAnsi="Calibri"/>
+          <w:b w:val="0"/>
+          <w:i/>
+          <w:color w:val="4B5563"/>
+          <w:sz w:val="19"/>
+        </w:rPr>
+        <w:t>Enterprise Distributed Banking System Topology: Presentation SPA, Edge Gateway, Microservices, PostgreSQL 16 Multi-Schema, Transactional Outbox, RabbitMQ, and Asynchronous Worker Daemons.</w:t>
+      </w:r>
+    </w:p>
+    <w:p>
+      <w:pPr>
         <w:pStyle w:val="Heading2"/>
         <w:keepNext/>
         <w:spacing w:before="280" w:after="120"/>
@@ -3577,6 +3643,72 @@
     </w:p>
     <w:p>
       <w:pPr>
+        <w:spacing w:before="200" w:after="80"/>
+        <w:jc w:val="center"/>
+      </w:pPr>
+      <w:r>
+        <w:drawing>
+          <wp:inline xmlns:a="http://schemas.openxmlformats.org/drawingml/2006/main" xmlns:pic="http://schemas.openxmlformats.org/drawingml/2006/picture">
+            <wp:extent cx="5669280" cy="3898947"/>
+            <wp:docPr id="2" name="Picture 2"/>
+            <wp:cNvGraphicFramePr>
+              <a:graphicFrameLocks noChangeAspect="1"/>
+            </wp:cNvGraphicFramePr>
+            <a:graphic>
+              <a:graphicData uri="http://schemas.openxmlformats.org/drawingml/2006/picture">
+                <pic:pic>
+                  <pic:nvPicPr>
+                    <pic:cNvPr id="0" name="fig2_transfer_sequence_flow.png"/>
+                    <pic:cNvPicPr/>
+                  </pic:nvPicPr>
+                  <pic:blipFill>
+                    <a:blip r:embed="rId10"/>
+                    <a:stretch>
+                      <a:fillRect/>
+                    </a:stretch>
+                  </pic:blipFill>
+                  <pic:spPr>
+                    <a:xfrm>
+                      <a:off x="0" y="0"/>
+                      <a:ext cx="5669280" cy="3898947"/>
+                    </a:xfrm>
+                    <a:prstGeom prst="rect"/>
+                  </pic:spPr>
+                </pic:pic>
+              </a:graphicData>
+            </a:graphic>
+          </wp:inline>
+        </w:drawing>
+      </w:r>
+    </w:p>
+    <w:p>
+      <w:pPr>
+        <w:spacing w:before="40" w:after="240" w:line="276" w:lineRule="auto"/>
+        <w:jc w:val="center"/>
+      </w:pPr>
+      <w:r>
+        <w:rPr>
+          <w:rFonts w:ascii="Calibri" w:hAnsi="Calibri"/>
+          <w:b/>
+          <w:i w:val="0"/>
+          <w:color w:val="1B365D"/>
+          <w:sz w:val="19"/>
+        </w:rPr>
+        <w:t xml:space="preserve">Figure 4.2: </w:t>
+      </w:r>
+      <w:r>
+        <w:rPr>
+          <w:rFonts w:ascii="Calibri" w:hAnsi="Calibri"/>
+          <w:b w:val="0"/>
+          <w:i/>
+          <w:color w:val="4B5563"/>
+          <w:sz w:val="19"/>
+        </w:rPr>
+        <w:t>End-to-End Distributed Money Transfer Protocol Execution: Sequential Ingress, Concurrency Row-Locking, Ledger Commit, Outbox Event Staging, and Asynchronous Worker Delivery.</w:t>
+      </w:r>
+    </w:p>
+    <w:p>
+      <w:pPr>
         <w:pStyle w:val="Heading2"/>
         <w:keepNext/>
         <w:spacing w:before="280" w:after="120"/>
@@ -3850,6 +3982,72 @@
     </w:p>
     <w:p>
       <w:pPr>
+        <w:spacing w:before="200" w:after="80"/>
+        <w:jc w:val="center"/>
+      </w:pPr>
+      <w:r>
+        <w:drawing>
+          <wp:inline xmlns:a="http://schemas.openxmlformats.org/drawingml/2006/main" xmlns:pic="http://schemas.openxmlformats.org/drawingml/2006/picture">
+            <wp:extent cx="5669280" cy="3328752"/>
+            <wp:docPr id="3" name="Picture 3"/>
+            <wp:cNvGraphicFramePr>
+              <a:graphicFrameLocks noChangeAspect="1"/>
+            </wp:cNvGraphicFramePr>
+            <a:graphic>
+              <a:graphicData uri="http://schemas.openxmlformats.org/drawingml/2006/picture">
+                <pic:pic>
+                  <pic:nvPicPr>
+                    <pic:cNvPr id="0" name="fig4_transactional_outbox.png"/>
+                    <pic:cNvPicPr/>
+                  </pic:nvPicPr>
+                  <pic:blipFill>
+                    <a:blip r:embed="rId11"/>
+                    <a:stretch>
+                      <a:fillRect/>
+                    </a:stretch>
+                  </pic:blipFill>
+                  <pic:spPr>
+                    <a:xfrm>
+                      <a:off x="0" y="0"/>
+                      <a:ext cx="5669280" cy="3328752"/>
+                    </a:xfrm>
+                    <a:prstGeom prst="rect"/>
+                  </pic:spPr>
+                </pic:pic>
+              </a:graphicData>
+            </a:graphic>
+          </wp:inline>
+        </w:drawing>
+      </w:r>
+    </w:p>
+    <w:p>
+      <w:pPr>
+        <w:spacing w:before="40" w:after="240" w:line="276" w:lineRule="auto"/>
+        <w:jc w:val="center"/>
+      </w:pPr>
+      <w:r>
+        <w:rPr>
+          <w:rFonts w:ascii="Calibri" w:hAnsi="Calibri"/>
+          <w:b/>
+          <w:i w:val="0"/>
+          <w:color w:val="1B365D"/>
+          <w:sz w:val="19"/>
+        </w:rPr>
+        <w:t xml:space="preserve">Figure 5.1: </w:t>
+      </w:r>
+      <w:r>
+        <w:rPr>
+          <w:rFonts w:ascii="Calibri" w:hAnsi="Calibri"/>
+          <w:b w:val="0"/>
+          <w:i/>
+          <w:color w:val="4B5563"/>
+          <w:sz w:val="19"/>
+        </w:rPr>
+        <w:t>Comparative Architectural Analysis: The Flawed Dual-Write Inconsistency Dilemma vs. The Resilient Transactional Outbox Pattern.</w:t>
+      </w:r>
+    </w:p>
+    <w:p>
+      <w:pPr>
         <w:pStyle w:val="Heading2"/>
         <w:keepNext/>
         <w:spacing w:before="280" w:after="120"/>
@@ -4050,6 +4248,72 @@
           <w:sz w:val="22"/>
         </w:rPr>
         <w:t>Fund transfers follow a strict unidirectional state machine: CREATED -&gt; PROCESSING -&gt; DEBITED -&gt; CREDITED -&gt; COMPLETED. If any step fails (e.g., insufficient funds during debit), the transfer immediately transitions to FAILED. Terminal states (COMPLETED and FAILED) are strictly immutable. Illegal backwards transitions (such as attempting to move from DEBITED back to PROCESSING) throw validation errors at both the domain model and database layer.</w:t>
+      </w:r>
+    </w:p>
+    <w:p>
+      <w:pPr>
+        <w:spacing w:before="200" w:after="80"/>
+        <w:jc w:val="center"/>
+      </w:pPr>
+      <w:r>
+        <w:drawing>
+          <wp:inline xmlns:a="http://schemas.openxmlformats.org/drawingml/2006/main" xmlns:pic="http://schemas.openxmlformats.org/drawingml/2006/picture">
+            <wp:extent cx="5486400" cy="2715491"/>
+            <wp:docPr id="4" name="Picture 4"/>
+            <wp:cNvGraphicFramePr>
+              <a:graphicFrameLocks noChangeAspect="1"/>
+            </wp:cNvGraphicFramePr>
+            <a:graphic>
+              <a:graphicData uri="http://schemas.openxmlformats.org/drawingml/2006/picture">
+                <pic:pic>
+                  <pic:nvPicPr>
+                    <pic:cNvPr id="0" name="fig3_state_machine.png"/>
+                    <pic:cNvPicPr/>
+                  </pic:nvPicPr>
+                  <pic:blipFill>
+                    <a:blip r:embed="rId12"/>
+                    <a:stretch>
+                      <a:fillRect/>
+                    </a:stretch>
+                  </pic:blipFill>
+                  <pic:spPr>
+                    <a:xfrm>
+                      <a:off x="0" y="0"/>
+                      <a:ext cx="5486400" cy="2715491"/>
+                    </a:xfrm>
+                    <a:prstGeom prst="rect"/>
+                  </pic:spPr>
+                </pic:pic>
+              </a:graphicData>
+            </a:graphic>
+          </wp:inline>
+        </w:drawing>
+      </w:r>
+    </w:p>
+    <w:p>
+      <w:pPr>
+        <w:spacing w:before="40" w:after="240" w:line="276" w:lineRule="auto"/>
+        <w:jc w:val="center"/>
+      </w:pPr>
+      <w:r>
+        <w:rPr>
+          <w:rFonts w:ascii="Calibri" w:hAnsi="Calibri"/>
+          <w:b/>
+          <w:i w:val="0"/>
+          <w:color w:val="1B365D"/>
+          <w:sz w:val="19"/>
+        </w:rPr>
+        <w:t xml:space="preserve">Figure 5.2: </w:t>
+      </w:r>
+      <w:r>
+        <w:rPr>
+          <w:rFonts w:ascii="Calibri" w:hAnsi="Calibri"/>
+          <w:b w:val="0"/>
+          <w:i/>
+          <w:color w:val="4B5563"/>
+          <w:sz w:val="19"/>
+        </w:rPr>
+        <w:t>Transfer Finite State Machine Transition Graph with Unidirectional Invariant Guards and Terminal States.</w:t>
       </w:r>
     </w:p>
     <w:p>
@@ -5184,6 +5448,72 @@
           <w:sz w:val="22"/>
         </w:rPr>
         <w:t>7. Ledger Statement Verification: The client refreshes the statement view; the ledger displays an immutable 'DEBIT' entry of 50,000 paise with the new running balance reflected in real-time.</w:t>
+      </w:r>
+    </w:p>
+    <w:p>
+      <w:pPr>
+        <w:spacing w:before="200" w:after="80"/>
+        <w:jc w:val="center"/>
+      </w:pPr>
+      <w:r>
+        <w:drawing>
+          <wp:inline xmlns:a="http://schemas.openxmlformats.org/drawingml/2006/main" xmlns:pic="http://schemas.openxmlformats.org/drawingml/2006/picture">
+            <wp:extent cx="5669280" cy="3164249"/>
+            <wp:docPr id="5" name="Picture 5"/>
+            <wp:cNvGraphicFramePr>
+              <a:graphicFrameLocks noChangeAspect="1"/>
+            </wp:cNvGraphicFramePr>
+            <a:graphic>
+              <a:graphicData uri="http://schemas.openxmlformats.org/drawingml/2006/picture">
+                <pic:pic>
+                  <pic:nvPicPr>
+                    <pic:cNvPr id="0" name="fig6_dashboard_ui.jpg"/>
+                    <pic:cNvPicPr/>
+                  </pic:nvPicPr>
+                  <pic:blipFill>
+                    <a:blip r:embed="rId13"/>
+                    <a:stretch>
+                      <a:fillRect/>
+                    </a:stretch>
+                  </pic:blipFill>
+                  <pic:spPr>
+                    <a:xfrm>
+                      <a:off x="0" y="0"/>
+                      <a:ext cx="5669280" cy="3164249"/>
+                    </a:xfrm>
+                    <a:prstGeom prst="rect"/>
+                  </pic:spPr>
+                </pic:pic>
+              </a:graphicData>
+            </a:graphic>
+          </wp:inline>
+        </w:drawing>
+      </w:r>
+    </w:p>
+    <w:p>
+      <w:pPr>
+        <w:spacing w:before="40" w:after="240" w:line="276" w:lineRule="auto"/>
+        <w:jc w:val="center"/>
+      </w:pPr>
+      <w:r>
+        <w:rPr>
+          <w:rFonts w:ascii="Calibri" w:hAnsi="Calibri"/>
+          <w:b/>
+          <w:i w:val="0"/>
+          <w:color w:val="1B365D"/>
+          <w:sz w:val="19"/>
+        </w:rPr>
+        <w:t xml:space="preserve">Figure 8.1: </w:t>
+      </w:r>
+      <w:r>
+        <w:rPr>
+          <w:rFonts w:ascii="Calibri" w:hAnsi="Calibri"/>
+          <w:b w:val="0"/>
+          <w:i/>
+          <w:color w:val="4B5563"/>
+          <w:sz w:val="19"/>
+        </w:rPr>
+        <w:t>Operational Banking Dashboard &amp; Transfer Workbench Interface: Sovereign Account Balances, Real-Time Status Polling, and Immutable Ledger Statement.</w:t>
       </w:r>
     </w:p>
     <w:p>
@@ -7375,6 +7705,72 @@
       <w:pPr>
         <w:spacing w:after="160"/>
       </w:pPr>
+    </w:p>
+    <w:p>
+      <w:pPr>
+        <w:spacing w:before="200" w:after="80"/>
+        <w:jc w:val="center"/>
+      </w:pPr>
+      <w:r>
+        <w:drawing>
+          <wp:inline xmlns:a="http://schemas.openxmlformats.org/drawingml/2006/main" xmlns:pic="http://schemas.openxmlformats.org/drawingml/2006/picture">
+            <wp:extent cx="5669280" cy="2288517"/>
+            <wp:docPr id="6" name="Picture 6"/>
+            <wp:cNvGraphicFramePr>
+              <a:graphicFrameLocks noChangeAspect="1"/>
+            </wp:cNvGraphicFramePr>
+            <a:graphic>
+              <a:graphicData uri="http://schemas.openxmlformats.org/drawingml/2006/picture">
+                <pic:pic>
+                  <pic:nvPicPr>
+                    <pic:cNvPr id="0" name="fig5_performance_benchmarks.png"/>
+                    <pic:cNvPicPr/>
+                  </pic:nvPicPr>
+                  <pic:blipFill>
+                    <a:blip r:embed="rId14"/>
+                    <a:stretch>
+                      <a:fillRect/>
+                    </a:stretch>
+                  </pic:blipFill>
+                  <pic:spPr>
+                    <a:xfrm>
+                      <a:off x="0" y="0"/>
+                      <a:ext cx="5669280" cy="2288517"/>
+                    </a:xfrm>
+                    <a:prstGeom prst="rect"/>
+                  </pic:spPr>
+                </pic:pic>
+              </a:graphicData>
+            </a:graphic>
+          </wp:inline>
+        </w:drawing>
+      </w:r>
+    </w:p>
+    <w:p>
+      <w:pPr>
+        <w:spacing w:before="40" w:after="240" w:line="276" w:lineRule="auto"/>
+        <w:jc w:val="center"/>
+      </w:pPr>
+      <w:r>
+        <w:rPr>
+          <w:rFonts w:ascii="Calibri" w:hAnsi="Calibri"/>
+          <w:b/>
+          <w:i w:val="0"/>
+          <w:color w:val="1B365D"/>
+          <w:sz w:val="19"/>
+        </w:rPr>
+        <w:t xml:space="preserve">Figure 9.1: </w:t>
+      </w:r>
+      <w:r>
+        <w:rPr>
+          <w:rFonts w:ascii="Calibri" w:hAnsi="Calibri"/>
+          <w:b w:val="0"/>
+          <w:i/>
+          <w:color w:val="4B5563"/>
+          <w:sz w:val="19"/>
+        </w:rPr>
+        <w:t>Empirical Performance &amp; Load Benchmarks (k6 Load Test: Throughput Curve under 50 Virtual Users &amp; Response Time Latency Distribution vs SLA Targets).</w:t>
+      </w:r>
     </w:p>
     <w:p>
       <w:pPr>

</xml_diff>